<commit_message>
Final word doc with screenshots
</commit_message>
<xml_diff>
--- a/docs/CalcApp - IS601 Final Project.docx
+++ b/docs/CalcApp - IS601 Final Project.docx
@@ -144,7 +144,13 @@
         <w:t>Reflection Document</w:t>
       </w:r>
       <w:r>
-        <w:t xml:space="preserve"> is added under the “docs” folder in project root.</w:t>
+        <w:t xml:space="preserve"> </w:t>
+      </w:r>
+      <w:r>
+        <w:t>A more detailed reflection summary is included in the docs/ folder inside the project repository</w:t>
+      </w:r>
+      <w:r>
+        <w:t>.</w:t>
       </w:r>
     </w:p>
     <w:p/>
@@ -165,6 +171,9 @@
     </w:p>
     <w:p>
       <w:r>
+        <w:rPr>
+          <w:noProof/>
+        </w:rPr>
         <w:drawing>
           <wp:inline distT="0" distB="0" distL="0" distR="0" wp14:anchorId="2EFD2E47" wp14:editId="6A0E348C">
             <wp:extent cx="5943600" cy="2931160"/>
@@ -228,6 +237,9 @@
     </w:p>
     <w:p>
       <w:r>
+        <w:rPr>
+          <w:noProof/>
+        </w:rPr>
         <w:drawing>
           <wp:inline distT="0" distB="0" distL="0" distR="0" wp14:anchorId="78C2EDD6" wp14:editId="24CABA66">
             <wp:extent cx="5943600" cy="2945130"/>
@@ -273,30 +285,125 @@
           <w:bCs/>
         </w:rPr>
       </w:pPr>
-      <w:proofErr w:type="spellStart"/>
-      <w:r>
-        <w:rPr>
-          <w:b/>
-          <w:bCs/>
-        </w:rPr>
-        <w:t>Pytest</w:t>
-      </w:r>
-      <w:proofErr w:type="spellEnd"/>
-      <w:r>
-        <w:rPr>
-          <w:b/>
-          <w:bCs/>
-        </w:rPr>
-        <w:t xml:space="preserve"> Result with 100% coverage:</w:t>
+    </w:p>
+    <w:p>
+      <w:pPr>
+        <w:rPr>
+          <w:b/>
+          <w:bCs/>
+        </w:rPr>
+      </w:pPr>
+    </w:p>
+    <w:p>
+      <w:pPr>
+        <w:rPr>
+          <w:b/>
+          <w:bCs/>
+        </w:rPr>
+      </w:pPr>
+    </w:p>
+    <w:p>
+      <w:pPr>
+        <w:rPr>
+          <w:b/>
+          <w:bCs/>
+        </w:rPr>
+      </w:pPr>
+    </w:p>
+    <w:p>
+      <w:pPr>
+        <w:rPr>
+          <w:b/>
+          <w:bCs/>
+        </w:rPr>
+      </w:pPr>
+    </w:p>
+    <w:p>
+      <w:pPr>
+        <w:rPr>
+          <w:b/>
+          <w:bCs/>
+        </w:rPr>
+      </w:pPr>
+    </w:p>
+    <w:p>
+      <w:pPr>
+        <w:rPr>
+          <w:b/>
+          <w:bCs/>
+        </w:rPr>
+      </w:pPr>
+    </w:p>
+    <w:p>
+      <w:pPr>
+        <w:rPr>
+          <w:b/>
+          <w:bCs/>
+        </w:rPr>
+      </w:pPr>
+    </w:p>
+    <w:p>
+      <w:pPr>
+        <w:rPr>
+          <w:b/>
+          <w:bCs/>
+        </w:rPr>
+      </w:pPr>
+    </w:p>
+    <w:p>
+      <w:pPr>
+        <w:rPr>
+          <w:b/>
+          <w:bCs/>
+        </w:rPr>
+      </w:pPr>
+    </w:p>
+    <w:p>
+      <w:pPr>
+        <w:rPr>
+          <w:b/>
+          <w:bCs/>
+        </w:rPr>
+      </w:pPr>
+    </w:p>
+    <w:p>
+      <w:pPr>
+        <w:rPr>
+          <w:b/>
+          <w:bCs/>
+        </w:rPr>
+      </w:pPr>
+    </w:p>
+    <w:p>
+      <w:pPr>
+        <w:rPr>
+          <w:b/>
+          <w:bCs/>
+        </w:rPr>
+      </w:pPr>
+      <w:r>
+        <w:rPr>
+          <w:b/>
+          <w:bCs/>
+        </w:rPr>
+        <w:lastRenderedPageBreak/>
+        <w:t>p</w:t>
+      </w:r>
+      <w:r>
+        <w:rPr>
+          <w:b/>
+          <w:bCs/>
+        </w:rPr>
+        <w:t>ytest Result with 100% coverage:</w:t>
       </w:r>
     </w:p>
     <w:p>
       <w:r>
         <w:drawing>
-          <wp:inline distT="0" distB="0" distL="0" distR="0" wp14:anchorId="3EFF0013" wp14:editId="44F9BE8B">
-            <wp:extent cx="5943600" cy="3086735"/>
-            <wp:effectExtent l="0" t="0" r="0" b="0"/>
-            <wp:docPr id="1718226373" name="Picture 1"/>
+          <wp:inline distT="0" distB="0" distL="0" distR="0" wp14:anchorId="49BAA587" wp14:editId="284F05F9">
+            <wp:extent cx="5943600" cy="3920490"/>
+            <wp:effectExtent l="0" t="0" r="0" b="3810"/>
+            <wp:docPr id="1944567824" name="Picture 1"/>
             <wp:cNvGraphicFramePr>
               <a:graphicFrameLocks xmlns:a="http://schemas.openxmlformats.org/drawingml/2006/main" noChangeAspect="1"/>
             </wp:cNvGraphicFramePr>
@@ -304,7 +411,7 @@
               <a:graphicData uri="http://schemas.openxmlformats.org/drawingml/2006/picture">
                 <pic:pic xmlns:pic="http://schemas.openxmlformats.org/drawingml/2006/picture">
                   <pic:nvPicPr>
-                    <pic:cNvPr id="1718226373" name=""/>
+                    <pic:cNvPr id="1944567824" name=""/>
                     <pic:cNvPicPr/>
                   </pic:nvPicPr>
                   <pic:blipFill>
@@ -316,7 +423,7 @@
                   <pic:spPr>
                     <a:xfrm>
                       <a:off x="0" y="0"/>
-                      <a:ext cx="5943600" cy="3086735"/>
+                      <a:ext cx="5943600" cy="3920490"/>
                     </a:xfrm>
                     <a:prstGeom prst="rect">
                       <a:avLst/>
@@ -329,8 +436,45 @@
         </w:drawing>
       </w:r>
     </w:p>
-    <w:p/>
-    <w:p/>
+    <w:p>
+      <w:r>
+        <w:drawing>
+          <wp:inline distT="0" distB="0" distL="0" distR="0" wp14:anchorId="0CCC758A" wp14:editId="3E8AE731">
+            <wp:extent cx="5943600" cy="3830955"/>
+            <wp:effectExtent l="0" t="0" r="0" b="0"/>
+            <wp:docPr id="1944816372" name="Picture 1"/>
+            <wp:cNvGraphicFramePr>
+              <a:graphicFrameLocks xmlns:a="http://schemas.openxmlformats.org/drawingml/2006/main" noChangeAspect="1"/>
+            </wp:cNvGraphicFramePr>
+            <a:graphic xmlns:a="http://schemas.openxmlformats.org/drawingml/2006/main">
+              <a:graphicData uri="http://schemas.openxmlformats.org/drawingml/2006/picture">
+                <pic:pic xmlns:pic="http://schemas.openxmlformats.org/drawingml/2006/picture">
+                  <pic:nvPicPr>
+                    <pic:cNvPr id="1944816372" name=""/>
+                    <pic:cNvPicPr/>
+                  </pic:nvPicPr>
+                  <pic:blipFill>
+                    <a:blip r:embed="rId10"/>
+                    <a:stretch>
+                      <a:fillRect/>
+                    </a:stretch>
+                  </pic:blipFill>
+                  <pic:spPr>
+                    <a:xfrm>
+                      <a:off x="0" y="0"/>
+                      <a:ext cx="5943600" cy="3830955"/>
+                    </a:xfrm>
+                    <a:prstGeom prst="rect">
+                      <a:avLst/>
+                    </a:prstGeom>
+                  </pic:spPr>
+                </pic:pic>
+              </a:graphicData>
+            </a:graphic>
+          </wp:inline>
+        </w:drawing>
+      </w:r>
+    </w:p>
     <w:sectPr>
       <w:pgSz w:w="12240" w:h="15840"/>
       <w:pgMar w:top="1440" w:right="1440" w:bottom="1440" w:left="1440" w:header="720" w:footer="720" w:gutter="0"/>

</xml_diff>